<commit_message>
TS 1.4 Ghanam Jatai tamil
</commit_message>
<xml_diff>
--- a/TS Jatai Ghanam Project/TS 1.4/TS 1.4 Ghanam Tamil Corrections.docx
+++ b/TS Jatai Ghanam Project/TS 1.4/TS 1.4 Ghanam Tamil Corrections.docx
@@ -1994,6 +1994,700 @@
                 <w:lang w:bidi="ta-IN"/>
               </w:rPr>
               <w:t xml:space="preserve">| </w:t>
+            </w:r>
+          </w:p>
+        </w:tc>
+      </w:tr>
+      <w:tr>
+        <w:trPr>
+          <w:trHeight w:val="1545"/>
+        </w:trPr>
+        <w:tc>
+          <w:tcPr>
+            <w:tcW w:w="7450" w:type="dxa"/>
+          </w:tcPr>
+          <w:p>
+            <w:pPr>
+              <w:autoSpaceDE w:val="0"/>
+              <w:autoSpaceDN w:val="0"/>
+              <w:adjustRightInd w:val="0"/>
+              <w:rPr>
+                <w:rFonts w:ascii="Latha" w:hAnsi="Latha" w:cs="Latha"/>
+                <w:szCs w:val="28"/>
+                <w:lang w:bidi="ta-IN"/>
+              </w:rPr>
+            </w:pPr>
+            <w:r>
+              <w:rPr>
+                <w:rFonts w:cs="Latha"/>
+                <w:b/>
+                <w:bCs/>
+                <w:szCs w:val="28"/>
+                <w:cs/>
+                <w:lang w:bidi="ta-IN"/>
+              </w:rPr>
+              <w:t>40</w:t>
+            </w:r>
+            <w:r>
+              <w:rPr>
+                <w:rFonts w:cs="Latha"/>
+                <w:b/>
+                <w:bCs/>
+                <w:szCs w:val="28"/>
+                <w:lang w:bidi="ta-IN"/>
+              </w:rPr>
+              <w:t>)</w:t>
+            </w:r>
+            <w:r>
+              <w:rPr>
+                <w:rFonts w:ascii="Latha" w:hAnsi="Latha" w:cs="Latha"/>
+                <w:szCs w:val="28"/>
+                <w:lang w:bidi="ta-IN"/>
+              </w:rPr>
+              <w:tab/>
+            </w:r>
+            <w:r>
+              <w:rPr>
+                <w:rFonts w:cs="Latha"/>
+                <w:b/>
+                <w:bCs/>
+                <w:szCs w:val="28"/>
+                <w:cs/>
+                <w:lang w:bidi="ta-IN"/>
+              </w:rPr>
+              <w:t>1</w:t>
+            </w:r>
+            <w:r>
+              <w:rPr>
+                <w:rFonts w:cs="Latha"/>
+                <w:b/>
+                <w:bCs/>
+                <w:szCs w:val="28"/>
+                <w:lang w:bidi="ta-IN"/>
+              </w:rPr>
+              <w:t>.</w:t>
+            </w:r>
+            <w:r>
+              <w:rPr>
+                <w:rFonts w:cs="Latha"/>
+                <w:b/>
+                <w:bCs/>
+                <w:szCs w:val="28"/>
+                <w:cs/>
+                <w:lang w:bidi="ta-IN"/>
+              </w:rPr>
+              <w:t>4.</w:t>
+            </w:r>
+            <w:r>
+              <w:rPr>
+                <w:rFonts w:cs="Latha"/>
+                <w:b/>
+                <w:bCs/>
+                <w:szCs w:val="28"/>
+                <w:cs/>
+                <w:lang w:bidi="ta-IN"/>
+              </w:rPr>
+              <w:t>46</w:t>
+            </w:r>
+            <w:r>
+              <w:rPr>
+                <w:rFonts w:cs="Latha"/>
+                <w:b/>
+                <w:bCs/>
+                <w:szCs w:val="28"/>
+                <w:lang w:bidi="ta-IN"/>
+              </w:rPr>
+              <w:t>.3</w:t>
+            </w:r>
+            <w:r>
+              <w:rPr>
+                <w:rFonts w:cs="Latha"/>
+                <w:b/>
+                <w:bCs/>
+                <w:szCs w:val="28"/>
+                <w:lang w:bidi="ta-IN"/>
+              </w:rPr>
+              <w:t>(</w:t>
+            </w:r>
+            <w:r>
+              <w:rPr>
+                <w:rFonts w:cs="Latha"/>
+                <w:b/>
+                <w:bCs/>
+                <w:szCs w:val="28"/>
+                <w:cs/>
+                <w:lang w:bidi="ta-IN"/>
+              </w:rPr>
+              <w:t>38</w:t>
+            </w:r>
+            <w:r>
+              <w:rPr>
+                <w:rFonts w:cs="Latha"/>
+                <w:b/>
+                <w:bCs/>
+                <w:szCs w:val="28"/>
+                <w:lang w:bidi="ta-IN"/>
+              </w:rPr>
+              <w:t>)</w:t>
+            </w:r>
+            <w:r>
+              <w:rPr>
+                <w:rFonts w:ascii="Latha" w:hAnsi="Latha" w:cs="Latha"/>
+                <w:szCs w:val="28"/>
+                <w:lang w:bidi="ta-IN"/>
+              </w:rPr>
+              <w:t xml:space="preserve">- </w:t>
+            </w:r>
+            <w:r>
+              <w:rPr>
+                <w:rFonts w:ascii="Latha" w:hAnsi="Latha" w:cs="Latha"/>
+                <w:szCs w:val="28"/>
+                <w:cs/>
+                <w:lang w:bidi="ta-IN"/>
+              </w:rPr>
+              <w:t>வாஜ</w:t>
+            </w:r>
+            <w:r>
+              <w:rPr>
+                <w:rFonts w:ascii="BRH Tamil Tab Extra" w:hAnsi="BRH Tamil Tab Extra" w:cs="Latha"/>
+                <w:b/>
+                <w:bCs/>
+                <w:sz w:val="32"/>
+                <w:szCs w:val="32"/>
+                <w:lang w:bidi="ta-IN"/>
+              </w:rPr>
+              <w:t>†</w:t>
+            </w:r>
+            <w:r>
+              <w:rPr>
+                <w:rFonts w:ascii="Latha" w:hAnsi="Latha" w:cs="Latha"/>
+                <w:szCs w:val="28"/>
+                <w:cs/>
+                <w:lang w:bidi="ta-IN"/>
+              </w:rPr>
+              <w:t xml:space="preserve">ஸாதௌ </w:t>
+            </w:r>
+            <w:r>
+              <w:rPr>
+                <w:rFonts w:ascii="Latha" w:hAnsi="Latha" w:cs="Latha"/>
+                <w:szCs w:val="28"/>
+                <w:lang w:bidi="ta-IN"/>
+              </w:rPr>
+              <w:t>||</w:t>
+            </w:r>
+          </w:p>
+          <w:p>
+            <w:pPr>
+              <w:autoSpaceDE w:val="0"/>
+              <w:autoSpaceDN w:val="0"/>
+              <w:adjustRightInd w:val="0"/>
+              <w:rPr>
+                <w:rFonts w:cs="Latha"/>
+                <w:b/>
+                <w:bCs/>
+                <w:szCs w:val="28"/>
+                <w:cs/>
+                <w:lang w:bidi="ta-IN"/>
+              </w:rPr>
+            </w:pPr>
+            <w:r>
+              <w:rPr>
+                <w:rFonts w:ascii="Latha" w:hAnsi="Latha" w:cs="Latha"/>
+                <w:szCs w:val="28"/>
+                <w:cs/>
+                <w:lang w:bidi="ta-IN"/>
+              </w:rPr>
+              <w:t>வாஜ</w:t>
+            </w:r>
+            <w:r>
+              <w:rPr>
+                <w:rFonts w:ascii="BRH Tamil Tab Extra" w:hAnsi="BRH Tamil Tab Extra" w:cs="Latha"/>
+                <w:b/>
+                <w:bCs/>
+                <w:sz w:val="32"/>
+                <w:szCs w:val="32"/>
+                <w:lang w:bidi="ta-IN"/>
+              </w:rPr>
+              <w:t>†</w:t>
+            </w:r>
+            <w:r>
+              <w:rPr>
+                <w:rFonts w:ascii="Latha" w:hAnsi="Latha" w:cs="Latha"/>
+                <w:szCs w:val="28"/>
+                <w:cs/>
+                <w:lang w:bidi="ta-IN"/>
+              </w:rPr>
+              <w:t>ஸா</w:t>
+            </w:r>
+            <w:r>
+              <w:rPr>
+                <w:rFonts w:ascii="Latha" w:hAnsi="Latha" w:cs="Latha"/>
+                <w:szCs w:val="28"/>
+                <w:highlight w:val="yellow"/>
+                <w:cs/>
+                <w:lang w:bidi="ta-IN"/>
+              </w:rPr>
+              <w:t>த</w:t>
+            </w:r>
+            <w:r>
+              <w:rPr>
+                <w:rFonts w:ascii="BRH Tamil Tab Extra" w:hAnsi="BRH Tamil Tab Extra" w:cs="Latha"/>
+                <w:b/>
+                <w:bCs/>
+                <w:sz w:val="32"/>
+                <w:szCs w:val="32"/>
+                <w:highlight w:val="yellow"/>
+                <w:lang w:bidi="ta-IN"/>
+              </w:rPr>
+              <w:t>…</w:t>
+            </w:r>
+            <w:r>
+              <w:rPr>
+                <w:rFonts w:ascii="Latha" w:hAnsi="Latha" w:cs="Latha"/>
+                <w:szCs w:val="28"/>
+                <w:cs/>
+                <w:lang w:bidi="ta-IN"/>
+              </w:rPr>
+              <w:t>விதி</w:t>
+            </w:r>
+            <w:r>
+              <w:rPr>
+                <w:rFonts w:ascii="BRH Tamil Tab Extra" w:hAnsi="BRH Tamil Tab Extra" w:cs="Latha"/>
+                <w:b/>
+                <w:bCs/>
+                <w:sz w:val="32"/>
+                <w:szCs w:val="32"/>
+                <w:lang w:bidi="ta-IN"/>
+              </w:rPr>
+              <w:t>…</w:t>
+            </w:r>
+            <w:r>
+              <w:rPr>
+                <w:rFonts w:ascii="Latha" w:hAnsi="Latha" w:cs="Latha"/>
+                <w:szCs w:val="28"/>
+                <w:lang w:bidi="ta-IN"/>
+              </w:rPr>
+              <w:t xml:space="preserve"> </w:t>
+            </w:r>
+            <w:r>
+              <w:rPr>
+                <w:rFonts w:ascii="Latha" w:hAnsi="Latha" w:cs="Latha"/>
+                <w:szCs w:val="28"/>
+                <w:cs/>
+                <w:lang w:bidi="ta-IN"/>
+              </w:rPr>
+              <w:t>வாஜ</w:t>
+            </w:r>
+            <w:r>
+              <w:rPr>
+                <w:rFonts w:ascii="BRH Tamil Tab Extra" w:hAnsi="BRH Tamil Tab Extra" w:cs="Latha"/>
+                <w:b/>
+                <w:bCs/>
+                <w:sz w:val="32"/>
+                <w:szCs w:val="32"/>
+                <w:lang w:bidi="ta-IN"/>
+              </w:rPr>
+              <w:t>†</w:t>
+            </w:r>
+            <w:r>
+              <w:rPr>
+                <w:rFonts w:ascii="Latha" w:hAnsi="Latha" w:cs="Latha"/>
+                <w:szCs w:val="28"/>
+                <w:lang w:bidi="ta-IN"/>
+              </w:rPr>
+              <w:t xml:space="preserve"> - </w:t>
+            </w:r>
+            <w:r>
+              <w:rPr>
+                <w:rFonts w:ascii="Latha" w:hAnsi="Latha" w:cs="Latha"/>
+                <w:szCs w:val="28"/>
+                <w:cs/>
+                <w:lang w:bidi="ta-IN"/>
+              </w:rPr>
+              <w:t>ஸா</w:t>
+            </w:r>
+            <w:r>
+              <w:rPr>
+                <w:rFonts w:ascii="BRH Tamil Tab Extra" w:hAnsi="BRH Tamil Tab Extra" w:cs="Latha"/>
+                <w:b/>
+                <w:bCs/>
+                <w:sz w:val="32"/>
+                <w:szCs w:val="32"/>
+                <w:lang w:bidi="ta-IN"/>
+              </w:rPr>
+              <w:t>…</w:t>
+            </w:r>
+            <w:r>
+              <w:rPr>
+                <w:rFonts w:ascii="Latha" w:hAnsi="Latha" w:cs="Latha"/>
+                <w:szCs w:val="28"/>
+                <w:cs/>
+                <w:lang w:bidi="ta-IN"/>
+              </w:rPr>
+              <w:t>தௌ</w:t>
+            </w:r>
+            <w:r>
+              <w:rPr>
+                <w:rFonts w:ascii="BRH Tamil Tab Extra" w:hAnsi="BRH Tamil Tab Extra" w:cs="Latha"/>
+                <w:b/>
+                <w:bCs/>
+                <w:sz w:val="32"/>
+                <w:szCs w:val="32"/>
+                <w:lang w:bidi="ta-IN"/>
+              </w:rPr>
+              <w:t>…</w:t>
+            </w:r>
+            <w:r>
+              <w:rPr>
+                <w:rFonts w:ascii="Latha" w:hAnsi="Latha" w:cs="Latha"/>
+                <w:szCs w:val="28"/>
+                <w:lang w:bidi="ta-IN"/>
+              </w:rPr>
+              <w:t xml:space="preserve"> |</w:t>
+            </w:r>
+          </w:p>
+        </w:tc>
+        <w:tc>
+          <w:tcPr>
+            <w:tcW w:w="6946" w:type="dxa"/>
+          </w:tcPr>
+          <w:p>
+            <w:pPr>
+              <w:autoSpaceDE w:val="0"/>
+              <w:autoSpaceDN w:val="0"/>
+              <w:adjustRightInd w:val="0"/>
+              <w:rPr>
+                <w:rFonts w:ascii="Latha" w:hAnsi="Latha" w:cs="Latha"/>
+                <w:szCs w:val="28"/>
+                <w:lang w:bidi="ta-IN"/>
+              </w:rPr>
+            </w:pPr>
+            <w:r>
+              <w:rPr>
+                <w:rFonts w:cs="Latha"/>
+                <w:b/>
+                <w:bCs/>
+                <w:szCs w:val="28"/>
+                <w:cs/>
+                <w:lang w:bidi="ta-IN"/>
+              </w:rPr>
+              <w:t>40</w:t>
+            </w:r>
+            <w:r>
+              <w:rPr>
+                <w:rFonts w:cs="Latha"/>
+                <w:b/>
+                <w:bCs/>
+                <w:szCs w:val="28"/>
+                <w:lang w:bidi="ta-IN"/>
+              </w:rPr>
+              <w:t>)</w:t>
+            </w:r>
+            <w:r>
+              <w:rPr>
+                <w:rFonts w:ascii="Latha" w:hAnsi="Latha" w:cs="Latha"/>
+                <w:szCs w:val="28"/>
+                <w:lang w:bidi="ta-IN"/>
+              </w:rPr>
+              <w:tab/>
+            </w:r>
+            <w:r>
+              <w:rPr>
+                <w:rFonts w:cs="Latha"/>
+                <w:b/>
+                <w:bCs/>
+                <w:szCs w:val="28"/>
+                <w:cs/>
+                <w:lang w:bidi="ta-IN"/>
+              </w:rPr>
+              <w:t>1</w:t>
+            </w:r>
+            <w:r>
+              <w:rPr>
+                <w:rFonts w:cs="Latha"/>
+                <w:b/>
+                <w:bCs/>
+                <w:szCs w:val="28"/>
+                <w:lang w:bidi="ta-IN"/>
+              </w:rPr>
+              <w:t>.</w:t>
+            </w:r>
+            <w:r>
+              <w:rPr>
+                <w:rFonts w:cs="Latha"/>
+                <w:b/>
+                <w:bCs/>
+                <w:szCs w:val="28"/>
+                <w:cs/>
+                <w:lang w:bidi="ta-IN"/>
+              </w:rPr>
+              <w:t>4.</w:t>
+            </w:r>
+            <w:r>
+              <w:rPr>
+                <w:rFonts w:cs="Latha"/>
+                <w:b/>
+                <w:bCs/>
+                <w:szCs w:val="28"/>
+                <w:cs/>
+                <w:lang w:bidi="ta-IN"/>
+              </w:rPr>
+              <w:t>46</w:t>
+            </w:r>
+            <w:r>
+              <w:rPr>
+                <w:rFonts w:cs="Latha"/>
+                <w:b/>
+                <w:bCs/>
+                <w:szCs w:val="28"/>
+                <w:lang w:bidi="ta-IN"/>
+              </w:rPr>
+              <w:t>.3</w:t>
+            </w:r>
+            <w:r>
+              <w:rPr>
+                <w:rFonts w:cs="Latha"/>
+                <w:b/>
+                <w:bCs/>
+                <w:szCs w:val="28"/>
+                <w:lang w:bidi="ta-IN"/>
+              </w:rPr>
+              <w:t>(</w:t>
+            </w:r>
+            <w:r>
+              <w:rPr>
+                <w:rFonts w:cs="Latha"/>
+                <w:b/>
+                <w:bCs/>
+                <w:szCs w:val="28"/>
+                <w:cs/>
+                <w:lang w:bidi="ta-IN"/>
+              </w:rPr>
+              <w:t>38</w:t>
+            </w:r>
+            <w:r>
+              <w:rPr>
+                <w:rFonts w:cs="Latha"/>
+                <w:b/>
+                <w:bCs/>
+                <w:szCs w:val="28"/>
+                <w:lang w:bidi="ta-IN"/>
+              </w:rPr>
+              <w:t>)</w:t>
+            </w:r>
+            <w:r>
+              <w:rPr>
+                <w:rFonts w:ascii="Latha" w:hAnsi="Latha" w:cs="Latha"/>
+                <w:szCs w:val="28"/>
+                <w:lang w:bidi="ta-IN"/>
+              </w:rPr>
+              <w:t xml:space="preserve">- </w:t>
+            </w:r>
+            <w:r>
+              <w:rPr>
+                <w:rFonts w:ascii="Latha" w:hAnsi="Latha" w:cs="Latha"/>
+                <w:szCs w:val="28"/>
+                <w:cs/>
+                <w:lang w:bidi="ta-IN"/>
+              </w:rPr>
+              <w:t>வாஜ</w:t>
+            </w:r>
+            <w:r>
+              <w:rPr>
+                <w:rFonts w:ascii="BRH Tamil Tab Extra" w:hAnsi="BRH Tamil Tab Extra" w:cs="Latha"/>
+                <w:b/>
+                <w:bCs/>
+                <w:sz w:val="32"/>
+                <w:szCs w:val="32"/>
+                <w:lang w:bidi="ta-IN"/>
+              </w:rPr>
+              <w:t>†</w:t>
+            </w:r>
+            <w:r>
+              <w:rPr>
+                <w:rFonts w:ascii="Latha" w:hAnsi="Latha" w:cs="Latha"/>
+                <w:szCs w:val="28"/>
+                <w:cs/>
+                <w:lang w:bidi="ta-IN"/>
+              </w:rPr>
+              <w:t xml:space="preserve">ஸாதௌ </w:t>
+            </w:r>
+            <w:r>
+              <w:rPr>
+                <w:rFonts w:ascii="Latha" w:hAnsi="Latha" w:cs="Latha"/>
+                <w:szCs w:val="28"/>
+                <w:lang w:bidi="ta-IN"/>
+              </w:rPr>
+              <w:t>||</w:t>
+            </w:r>
+          </w:p>
+          <w:p>
+            <w:pPr>
+              <w:autoSpaceDE w:val="0"/>
+              <w:autoSpaceDN w:val="0"/>
+              <w:adjustRightInd w:val="0"/>
+              <w:rPr>
+                <w:rFonts w:cs="Latha"/>
+                <w:b/>
+                <w:bCs/>
+                <w:szCs w:val="28"/>
+                <w:cs/>
+                <w:lang w:bidi="ta-IN"/>
+              </w:rPr>
+            </w:pPr>
+            <w:r>
+              <w:rPr>
+                <w:rFonts w:ascii="Latha" w:hAnsi="Latha" w:cs="Latha"/>
+                <w:szCs w:val="28"/>
+                <w:cs/>
+                <w:lang w:bidi="ta-IN"/>
+              </w:rPr>
+              <w:t>வாஜ</w:t>
+            </w:r>
+            <w:r>
+              <w:rPr>
+                <w:rFonts w:ascii="BRH Tamil Tab Extra" w:hAnsi="BRH Tamil Tab Extra" w:cs="Latha"/>
+                <w:b/>
+                <w:bCs/>
+                <w:sz w:val="32"/>
+                <w:szCs w:val="32"/>
+                <w:lang w:bidi="ta-IN"/>
+              </w:rPr>
+              <w:t>†</w:t>
+            </w:r>
+            <w:r>
+              <w:rPr>
+                <w:rFonts w:ascii="Latha" w:hAnsi="Latha" w:cs="Latha"/>
+                <w:szCs w:val="28"/>
+                <w:cs/>
+                <w:lang w:bidi="ta-IN"/>
+              </w:rPr>
+              <w:t>ஸா</w:t>
+            </w:r>
+            <w:r>
+              <w:rPr>
+                <w:rFonts w:ascii="Latha" w:hAnsi="Latha" w:cs="Latha"/>
+                <w:szCs w:val="28"/>
+                <w:highlight w:val="green"/>
+                <w:cs/>
+                <w:lang w:bidi="ta-IN"/>
+              </w:rPr>
+              <w:t>தா</w:t>
+            </w:r>
+            <w:r>
+              <w:rPr>
+                <w:rFonts w:ascii="BRH Tamil Tab Extra" w:hAnsi="BRH Tamil Tab Extra" w:cs="Latha"/>
+                <w:b/>
+                <w:bCs/>
+                <w:sz w:val="32"/>
+                <w:szCs w:val="32"/>
+                <w:lang w:bidi="ta-IN"/>
+              </w:rPr>
+              <w:t>…</w:t>
+            </w:r>
+            <w:r>
+              <w:rPr>
+                <w:rFonts w:ascii="Latha" w:hAnsi="Latha" w:cs="Latha"/>
+                <w:szCs w:val="28"/>
+                <w:cs/>
+                <w:lang w:bidi="ta-IN"/>
+              </w:rPr>
+              <w:t>விதி</w:t>
+            </w:r>
+            <w:r>
+              <w:rPr>
+                <w:rFonts w:ascii="BRH Tamil Tab Extra" w:hAnsi="BRH Tamil Tab Extra" w:cs="Latha"/>
+                <w:b/>
+                <w:bCs/>
+                <w:sz w:val="32"/>
+                <w:szCs w:val="32"/>
+                <w:lang w:bidi="ta-IN"/>
+              </w:rPr>
+              <w:t>…</w:t>
+            </w:r>
+            <w:r>
+              <w:rPr>
+                <w:rFonts w:ascii="Latha" w:hAnsi="Latha" w:cs="Latha"/>
+                <w:szCs w:val="28"/>
+                <w:lang w:bidi="ta-IN"/>
+              </w:rPr>
+              <w:t xml:space="preserve"> </w:t>
+            </w:r>
+            <w:r>
+              <w:rPr>
+                <w:rFonts w:ascii="Latha" w:hAnsi="Latha" w:cs="Latha"/>
+                <w:szCs w:val="28"/>
+                <w:cs/>
+                <w:lang w:bidi="ta-IN"/>
+              </w:rPr>
+              <w:t>வாஜ</w:t>
+            </w:r>
+            <w:r>
+              <w:rPr>
+                <w:rFonts w:ascii="BRH Tamil Tab Extra" w:hAnsi="BRH Tamil Tab Extra" w:cs="Latha"/>
+                <w:b/>
+                <w:bCs/>
+                <w:sz w:val="32"/>
+                <w:szCs w:val="32"/>
+                <w:lang w:bidi="ta-IN"/>
+              </w:rPr>
+              <w:t>†</w:t>
+            </w:r>
+            <w:r>
+              <w:rPr>
+                <w:rFonts w:ascii="Latha" w:hAnsi="Latha" w:cs="Latha"/>
+                <w:szCs w:val="28"/>
+                <w:lang w:bidi="ta-IN"/>
+              </w:rPr>
+              <w:t xml:space="preserve"> - </w:t>
+            </w:r>
+            <w:r>
+              <w:rPr>
+                <w:rFonts w:ascii="Latha" w:hAnsi="Latha" w:cs="Latha"/>
+                <w:szCs w:val="28"/>
+                <w:cs/>
+                <w:lang w:bidi="ta-IN"/>
+              </w:rPr>
+              <w:t>ஸா</w:t>
+            </w:r>
+            <w:r>
+              <w:rPr>
+                <w:rFonts w:ascii="BRH Tamil Tab Extra" w:hAnsi="BRH Tamil Tab Extra" w:cs="Latha"/>
+                <w:b/>
+                <w:bCs/>
+                <w:sz w:val="32"/>
+                <w:szCs w:val="32"/>
+                <w:lang w:bidi="ta-IN"/>
+              </w:rPr>
+              <w:t>…</w:t>
+            </w:r>
+            <w:r>
+              <w:rPr>
+                <w:rFonts w:ascii="Latha" w:hAnsi="Latha" w:cs="Latha"/>
+                <w:szCs w:val="28"/>
+                <w:cs/>
+                <w:lang w:bidi="ta-IN"/>
+              </w:rPr>
+              <w:t>தௌ</w:t>
+            </w:r>
+            <w:r>
+              <w:rPr>
+                <w:rFonts w:ascii="BRH Tamil Tab Extra" w:hAnsi="BRH Tamil Tab Extra" w:cs="Latha"/>
+                <w:b/>
+                <w:bCs/>
+                <w:sz w:val="32"/>
+                <w:szCs w:val="32"/>
+                <w:lang w:bidi="ta-IN"/>
+              </w:rPr>
+              <w:t>…</w:t>
+            </w:r>
+            <w:r>
+              <w:rPr>
+                <w:rFonts w:ascii="Latha" w:hAnsi="Latha" w:cs="Latha"/>
+                <w:szCs w:val="28"/>
+                <w:lang w:bidi="ta-IN"/>
+              </w:rPr>
+              <w:t xml:space="preserve"> |</w:t>
             </w:r>
           </w:p>
         </w:tc>
@@ -2159,7 +2853,6 @@
           <w:szCs w:val="32"/>
           <w:u w:val="single"/>
         </w:rPr>
-        <w:lastRenderedPageBreak/>
         <w:t xml:space="preserve">TS </w:t>
       </w:r>
       <w:r>
@@ -3898,6 +4591,7 @@
                 <w:sz w:val="32"/>
                 <w:szCs w:val="40"/>
               </w:rPr>
+              <w:lastRenderedPageBreak/>
               <w:t xml:space="preserve"> </w:t>
             </w:r>
             <w:r>
@@ -4468,7 +5162,6 @@
                 <w:cs/>
                 <w:lang w:bidi="ta-IN"/>
               </w:rPr>
-              <w:lastRenderedPageBreak/>
               <w:t>ஸு</w:t>
             </w:r>
             <w:r>
@@ -7017,6 +7710,7 @@
                 <w:cs/>
                 <w:lang w:bidi="ta-IN"/>
               </w:rPr>
+              <w:lastRenderedPageBreak/>
               <w:t>41</w:t>
             </w:r>
             <w:r>
@@ -7602,7 +8296,6 @@
                 <w:cs/>
                 <w:lang w:bidi="ta-IN"/>
               </w:rPr>
-              <w:lastRenderedPageBreak/>
               <w:t>ஸுப</w:t>
             </w:r>
             <w:r>
@@ -9692,7 +10385,17 @@
                 <w:cs/>
                 <w:lang w:bidi="ta-IN"/>
               </w:rPr>
-              <w:t>க்ஷ ம</w:t>
+              <w:t xml:space="preserve">க்ஷ </w:t>
+            </w:r>
+            <w:r>
+              <w:rPr>
+                <w:rFonts w:ascii="Latha" w:hAnsi="Latha" w:cs="Latha"/>
+                <w:szCs w:val="28"/>
+                <w:cs/>
+                <w:lang w:bidi="ta-IN"/>
+              </w:rPr>
+              <w:lastRenderedPageBreak/>
+              <w:t>ம</w:t>
             </w:r>
             <w:r>
               <w:rPr>
@@ -9875,6 +10578,7 @@
                 <w:cs/>
                 <w:lang w:bidi="ta-IN"/>
               </w:rPr>
+              <w:lastRenderedPageBreak/>
               <w:t>33</w:t>
             </w:r>
             <w:r>
@@ -11045,7 +11749,17 @@
                 <w:cs/>
                 <w:lang w:bidi="ta-IN"/>
               </w:rPr>
-              <w:t>க்ஷ ம</w:t>
+              <w:t xml:space="preserve">க்ஷ </w:t>
+            </w:r>
+            <w:r>
+              <w:rPr>
+                <w:rFonts w:ascii="Latha" w:hAnsi="Latha" w:cs="Latha"/>
+                <w:szCs w:val="28"/>
+                <w:cs/>
+                <w:lang w:bidi="ta-IN"/>
+              </w:rPr>
+              <w:lastRenderedPageBreak/>
+              <w:t>ம</w:t>
             </w:r>
             <w:r>
               <w:rPr>
@@ -14989,6 +15703,7 @@
                 <w:cs/>
                 <w:lang w:bidi="ta-IN"/>
               </w:rPr>
+              <w:lastRenderedPageBreak/>
               <w:t>28</w:t>
             </w:r>
             <w:r>
@@ -15651,17 +16366,7 @@
                 <w:cs/>
                 <w:lang w:bidi="ta-IN"/>
               </w:rPr>
-              <w:t xml:space="preserve"> </w:t>
-            </w:r>
-            <w:r>
-              <w:rPr>
-                <w:rFonts w:ascii="Latha" w:hAnsi="Latha" w:cs="Latha"/>
-                <w:szCs w:val="28"/>
-                <w:cs/>
-                <w:lang w:bidi="ta-IN"/>
-              </w:rPr>
-              <w:lastRenderedPageBreak/>
-              <w:t>ஸ</w:t>
+              <w:t xml:space="preserve"> ஸ</w:t>
             </w:r>
             <w:r>
               <w:rPr>
@@ -16212,7 +16917,6 @@
                 <w:cs/>
                 <w:lang w:bidi="ta-IN"/>
               </w:rPr>
-              <w:lastRenderedPageBreak/>
               <w:t>28</w:t>
             </w:r>
             <w:r>
@@ -16876,17 +17580,7 @@
                 <w:cs/>
                 <w:lang w:bidi="ta-IN"/>
               </w:rPr>
-              <w:t xml:space="preserve"> </w:t>
-            </w:r>
-            <w:r>
-              <w:rPr>
-                <w:rFonts w:ascii="Latha" w:hAnsi="Latha" w:cs="Latha"/>
-                <w:szCs w:val="28"/>
-                <w:cs/>
-                <w:lang w:bidi="ta-IN"/>
-              </w:rPr>
-              <w:lastRenderedPageBreak/>
-              <w:t>ஸ</w:t>
+              <w:t xml:space="preserve"> ஸ</w:t>
             </w:r>
             <w:r>
               <w:rPr>
@@ -17450,7 +18144,6 @@
                 <w:cs/>
                 <w:lang w:bidi="ta-IN"/>
               </w:rPr>
-              <w:lastRenderedPageBreak/>
               <w:t>23</w:t>
             </w:r>
             <w:r>
@@ -18119,7 +18812,25 @@
                 <w:sz w:val="32"/>
                 <w:szCs w:val="40"/>
               </w:rPr>
-              <w:t>(it is deergham)</w:t>
+              <w:t xml:space="preserve">(it is </w:t>
+            </w:r>
+            <w:proofErr w:type="spellStart"/>
+            <w:r>
+              <w:rPr>
+                <w:rFonts w:cs="Arial"/>
+                <w:sz w:val="32"/>
+                <w:szCs w:val="40"/>
+              </w:rPr>
+              <w:t>deergham</w:t>
+            </w:r>
+            <w:proofErr w:type="spellEnd"/>
+            <w:r>
+              <w:rPr>
+                <w:rFonts w:cs="Arial"/>
+                <w:sz w:val="32"/>
+                <w:szCs w:val="40"/>
+              </w:rPr>
+              <w:t>)</w:t>
             </w:r>
           </w:p>
           <w:p>

</xml_diff>